<commit_message>
docs: update detailed MVP specification docx with final refactored architecture details
</commit_message>
<xml_diff>
--- a/AuraOS_MVP_Detailed_Specification.docx
+++ b/AuraOS_MVP_Detailed_Specification.docx
@@ -27,7 +27,7 @@
           <w:color w:val="64748B"/>
           <w:sz w:val="28"/>
         </w:rPr>
-        <w:t>Minimum Viable Product (MVP) Technical Specification &amp; Architecture Manual</w:t>
+        <w:t>Refactored MVP Technical Specification &amp; Architecture Manual</w:t>
       </w:r>
     </w:p>
     <w:p>
@@ -49,12 +49,7 @@
     </w:p>
     <w:p>
       <w:r>
-        <w:t>AuraOS is a secure, cloud-native, and resource-efficient middleware orchestrator designed for running autonomous artificial intelligence (AI) agents inside isolated environments. Unlike traditional architectures where agents run with open permissions, leading to potential host system compromises or runaway resource utilization, AuraOS introduces Cognitive Containers. These sandboxed micro-containers wrap Python and Node.js code under strict Linux cgroup limits, read-only filesystems, and automated lifecycle triggers.</w:t>
-      </w:r>
-    </w:p>
-    <w:p>
-      <w:r>
-        <w:t>The primary goal of this MVP is to establish a secure execution lifecycle for agent workloads, incorporating state hydration, semantic vector memory storage, Chronos scheduling triggers (Cron &amp; Webhooks), a headless browser automation API pool, and a real-time monitoring developer control panel.</w:t>
+        <w:t>This document describes the refactored, production-grade Minimum Viable Product (MVP) of the AuraOS middleware. AuraOS is a secure, resource-efficient orchestration engine designed to run autonomous artificial intelligence agents in sandboxed, usage-metered environments. In response to over-engineering risks and production constraints, we removed heavy browser pool services, simplified the developer control center, implemented secure egress proxying, added file-based checkpoint hydration, and integrated a usage billing metering engine.</w:t>
       </w:r>
     </w:p>
     <w:p>
@@ -70,7 +65,7 @@
     </w:p>
     <w:p>
       <w:r>
-        <w:t>AuraOS is designed around a modular microservices architecture, communicating asynchronously via event brokers and WebSockets. The system consists of five primary subsystem layers:</w:t>
+        <w:t>The AuraOS architecture consists of five core components working in synchronization:</w:t>
       </w:r>
     </w:p>
     <w:p>
@@ -78,7 +73,7 @@
         <w:pStyle w:val="ListBullet"/>
       </w:pPr>
       <w:r>
-        <w:t>1. Database &amp; Persistence Layer (PostgreSQL + pgvector):</w:t>
+        <w:t>1. Database Layer (PostgreSQL + pgvector): Persistence of agent properties, executions history, state checkpoints, and semantic high-dimensional vector memories.</w:t>
       </w:r>
     </w:p>
     <w:p>
@@ -86,7 +81,7 @@
         <w:pStyle w:val="ListBullet"/>
       </w:pPr>
       <w:r>
-        <w:t>Stores agent configs, historical execution logs, immutable state variable checkpoints, and high-dimensional semantic memory vector arrays.</w:t>
+        <w:t>2. Docker Sandbox Supervisor: Low-level client interface with Linux cgroups (128MB RAM, 0.5 CPU, 32 PIDs) enforcing read-only rootfs filesystems and tmpfs execution folders.</w:t>
       </w:r>
     </w:p>
     <w:p>
@@ -94,7 +89,7 @@
         <w:pStyle w:val="ListBullet"/>
       </w:pPr>
       <w:r>
-        <w:t>2. Sandbox Orchestration Layer (Docker Engine API):</w:t>
+        <w:t>3. Egress Proxy Gateway: Custom HTTP/HTTPS CONNECT proxy server filtering all container network requests against a domain-level allowlist.</w:t>
       </w:r>
     </w:p>
     <w:p>
@@ -102,7 +97,7 @@
         <w:pStyle w:val="ListBullet"/>
       </w:pPr>
       <w:r>
-        <w:t>Spawns isolated cgroup-constrained micro-containers dynamically on wakeup triggers, executes custom code, captures stdout/stderr streams, and cleans up containers upon termination.</w:t>
+        <w:t>4. Chronos Trigger System: Asynchronous event listeners handling time-cron triggers, webhook invocations, and database change notifications (Supabase mock).</w:t>
       </w:r>
     </w:p>
     <w:p>
@@ -110,47 +105,7 @@
         <w:pStyle w:val="ListBullet"/>
       </w:pPr>
       <w:r>
-        <w:t>3. Chronos Trigger Layer (Webhook &amp; Cron Schedulers):</w:t>
-      </w:r>
-    </w:p>
-    <w:p>
-      <w:pPr>
-        <w:pStyle w:val="ListBullet"/>
-      </w:pPr>
-      <w:r>
-        <w:t>Listens to external webhooks or recurring cron intervals to trigger agent wakeup sequences or initiate graceful hibernations.</w:t>
-      </w:r>
-    </w:p>
-    <w:p>
-      <w:pPr>
-        <w:pStyle w:val="ListBullet"/>
-      </w:pPr>
-      <w:r>
-        <w:t>4. Playwright Headless Browser Pool Service:</w:t>
-      </w:r>
-    </w:p>
-    <w:p>
-      <w:pPr>
-        <w:pStyle w:val="ListBullet"/>
-      </w:pPr>
-      <w:r>
-        <w:t>Maintains a hot pool of reusable browser contexts, allowing network-isolated or secure web scraping, screenshot capture, and cookie/localStorage session serialization.</w:t>
-      </w:r>
-    </w:p>
-    <w:p>
-      <w:pPr>
-        <w:pStyle w:val="ListBullet"/>
-      </w:pPr>
-      <w:r>
-        <w:t>5. Developer Control Center (React Web Dashboard):</w:t>
-      </w:r>
-    </w:p>
-    <w:p>
-      <w:pPr>
-        <w:pStyle w:val="ListBullet"/>
-      </w:pPr>
-      <w:r>
-        <w:t>Streams real-time metrics, console output logs, state inspector variables, and horizontal timeline transitions from backend core servers using WebSockets.</w:t>
+        <w:t>5. Developer Control Center (Simplified Console Dashboard): Minimalist Vite-React front-end streaming live container logs and serverless execution billing metrics.</w:t>
       </w:r>
     </w:p>
     <w:p>
@@ -172,12 +127,12 @@
         <w:rPr>
           <w:color w:val="0A0A0A"/>
         </w:rPr>
-        <w:t>3.1 Module 1 - Cognitive Container (Sandbox)</w:t>
+        <w:t>3.1 Module 1 - Cognitive Sandbox &amp; Egress Gateway</w:t>
       </w:r>
     </w:p>
     <w:p>
       <w:r>
-        <w:t>The sandbox environment enforces security and isolation boundaries around executing agent code. When an agent is triggered, the system invokes the Docker Engine API to create a container from one of two pre-built runner images:</w:t>
+        <w:t>Outbound container traffic is routed through the local Egress Proxy running on host port 8086. This replaces binary network blocks and prevents data exfiltration while keeping AI APIs open.</w:t>
       </w:r>
     </w:p>
     <w:p>
@@ -185,7 +140,7 @@
         <w:pStyle w:val="ListBullet"/>
       </w:pPr>
       <w:r>
-        <w:t>- Python Runner (auraos-python-runner): Python 3.12-slim environment running as a non-root 'sandbox' user.</w:t>
+        <w:t>- Network Routing: Container environment variables HTTP_PROXY and HTTPS_PROXY point to http://host.docker.internal:8086. Resolution is mapped via ExtraHosts.</w:t>
       </w:r>
     </w:p>
     <w:p>
@@ -193,12 +148,7 @@
         <w:pStyle w:val="ListBullet"/>
       </w:pPr>
       <w:r>
-        <w:t>- Node.js Runner (auraos-node-runner): Node.js 20-alpine environment running as a non-root 'sandbox' user.</w:t>
-      </w:r>
-    </w:p>
-    <w:p>
-      <w:r>
-        <w:t>Resource constraints are applied at container instantiation:</w:t>
+        <w:t>- Allowed Domains: Egress proxy permits: api.openai.com, api.anthropic.com, api.cohere.ai, api.groq.com, github.com, registry.npmjs.org, pypi.org. All other domains are immediately blocked with an HTTP 403 Forbidden payload.</w:t>
       </w:r>
     </w:p>
     <w:p>
@@ -206,39 +156,7 @@
         <w:pStyle w:val="ListBullet"/>
       </w:pPr>
       <w:r>
-        <w:t>- Memory Limit: Default 256MB hard boundary with swap space disabled (MemorySwap set equal to Memory) to prevent disk thrashing.</w:t>
-      </w:r>
-    </w:p>
-    <w:p>
-      <w:pPr>
-        <w:pStyle w:val="ListBullet"/>
-      </w:pPr>
-      <w:r>
-        <w:t>- CPU constraint: Scaled using NanoCpus (default 0.5 CPU shares).</w:t>
-      </w:r>
-    </w:p>
-    <w:p>
-      <w:pPr>
-        <w:pStyle w:val="ListBullet"/>
-      </w:pPr>
-      <w:r>
-        <w:t>- Process Limit (PidsLimit): Cap at 64 concurrent threads to protect against fork-bomb attacks.</w:t>
-      </w:r>
-    </w:p>
-    <w:p>
-      <w:pPr>
-        <w:pStyle w:val="ListBullet"/>
-      </w:pPr>
-      <w:r>
-        <w:t>- Network Isolation: Optional NetworkDisabled configuration flag to prevent data exfiltration.</w:t>
-      </w:r>
-    </w:p>
-    <w:p>
-      <w:pPr>
-        <w:pStyle w:val="ListBullet"/>
-      </w:pPr>
-      <w:r>
-        <w:t>- Read-Only Protection: ReadonlyRootfs is set to true. Filesystem writes are locked except for a size-capped 64MB memory-resident tmpfs mount at /tmp.</w:t>
+        <w:t>- Resource Enforcements: Hard boundary limit of 128MB RAM (swap disabled), 0.5 CPU shares (NanoCpus), 32 process PID cap, and ReadonlyRootfs = true with 64MB /tmp tmpfs.</w:t>
       </w:r>
     </w:p>
     <w:p>
@@ -249,17 +167,12 @@
         <w:rPr>
           <w:color w:val="0A0A0A"/>
         </w:rPr>
-        <w:t>3.2 Module 2 - State &amp; Memory Engine</w:t>
+        <w:t>3.2 Module 2 - State Engine &amp; Checkpoint Recovery</w:t>
       </w:r>
     </w:p>
     <w:p>
       <w:r>
-        <w:t>The Memory Engine integrates pgvector inside PostgreSQL to enable long-term associative recall. High-dimensional vector embeddings are stored in the vector_memories table. A cosine distance index (HNSW / vector_cosine_ops) is applied to allow semantic memory retrieval using the PostgreSQL &lt;=&gt; operator.</w:t>
-      </w:r>
-    </w:p>
-    <w:p>
-      <w:r>
-        <w:t>The State Engine serializes agent runtime contexts dynamically. When an agent enters hibernation, its state variables are captured as an immutable JSONB block and stored in the states table. Upon wakeup, the variables are re-injected (hydrated) into the container, ensuring execution continuity.</w:t>
+        <w:t>To protect agent execution states from sudden OOM (Out of Memory) crashes, the State Engine implements intermediate file-based checkpointing. While executing, the agent script writes progress variables to the size-restricted /tmp/state_checkpoint.json file inside the container's tmpfs volume. Prior to container cleanup (even if the container exited with a non-zero exit code or timeout), the orchestrator executes a 'docker cp' command to retrieve the checkpoint. Recovered variables are parsed, merged, and saved to the PostgreSQL database, guaranteeing progress preservation.</w:t>
       </w:r>
     </w:p>
     <w:p>
@@ -270,12 +183,29 @@
         <w:rPr>
           <w:color w:val="0A0A0A"/>
         </w:rPr>
-        <w:t>3.3 Module 3 - Chronos Trigger System</w:t>
+        <w:t>3.3 Module 3 - Usage Billing &amp; Metering Layer</w:t>
       </w:r>
     </w:p>
     <w:p>
       <w:r>
-        <w:t>The Chronos Trigger System manages agent lifecycles asynchronously. It features a Webhook Listener starting a native HTTP server (port 8081). Webhook endpoints (POST /webhook/:id) accept JSON payloads, wake up target agents, and pass trigger parameters. In addition, a Cron Trigger based on node-cron schedules periodic executions (e.g. for telemetry audits) that match database cron rules.</w:t>
+        <w:t>The Metering Layer tracks execution runtime metrics in real-time. Upon sandbox execution termination, the event broker computes execution costs based on standard serverless pricing:</w:t>
+      </w:r>
+    </w:p>
+    <w:p>
+      <w:pPr>
+        <w:jc w:val="center"/>
+      </w:pPr>
+      <w:r>
+        <w:rPr>
+          <w:b/>
+          <w:color w:val="10B981"/>
+        </w:rPr>
+        <w:t>Execution Cost = Duration (seconds) * (Allocated RAM / 1024) * $0.00001667</w:t>
+      </w:r>
+    </w:p>
+    <w:p>
+      <w:r>
+        <w:t>Duration (ms), allocated RAM (MB), and final computed cost are saved in the executions table database and streamed live over WebSockets to be displayed in the terminal logs console header.</w:t>
       </w:r>
     </w:p>
     <w:p>
@@ -286,12 +216,12 @@
         <w:rPr>
           <w:color w:val="0A0A0A"/>
         </w:rPr>
-        <w:t>3.4 Module 4 - Headless Browser API</w:t>
+        <w:t>3.4 Module 4 - Expanded Chronos Trigger System</w:t>
       </w:r>
     </w:p>
     <w:p>
       <w:r>
-        <w:t>To perform web interactions without spawning browser processes per action, AuraOS maintains a BrowserContext pool inside Playwright. The pool manages reusable, isolated Chromium contexts. Supported actions include:</w:t>
+        <w:t>Chronos handles three categories of event triggers:</w:t>
       </w:r>
     </w:p>
     <w:p>
@@ -299,7 +229,7 @@
         <w:pStyle w:val="ListBullet"/>
       </w:pPr>
       <w:r>
-        <w:t>- navigate: Navigate to targeted URL.</w:t>
+        <w:t>1. Custom Webhooks: Target endpoints (POST /webhook/:id) for manual API invocations.</w:t>
       </w:r>
     </w:p>
     <w:p>
@@ -307,7 +237,7 @@
         <w:pStyle w:val="ListBullet"/>
       </w:pPr>
       <w:r>
-        <w:t>- get_html / get_text: Scrap raw HTML markup or plain text.</w:t>
+        <w:t>2. Time Cron Schedulers: Recurring node-cron intervals triggered directly from database rules.</w:t>
       </w:r>
     </w:p>
     <w:p>
@@ -315,23 +245,7 @@
         <w:pStyle w:val="ListBullet"/>
       </w:pPr>
       <w:r>
-        <w:t>- click / type / select / submit: Simulate mouse and keyboard input on form elements.</w:t>
-      </w:r>
-    </w:p>
-    <w:p>
-      <w:pPr>
-        <w:pStyle w:val="ListBullet"/>
-      </w:pPr>
-      <w:r>
-        <w:t>- screenshot: Capture rendering results as PNG base64 strings.</w:t>
-      </w:r>
-    </w:p>
-    <w:p>
-      <w:pPr>
-        <w:pStyle w:val="ListBullet"/>
-      </w:pPr>
-      <w:r>
-        <w:t>- save_session / load_session: Serialize cookies and localStorage values to disk to maintain logged-in states across runs.</w:t>
+        <w:t>3. Database Change Listeners: Endpoint POST /webhook/db-change listening to mock database mutations (Supabase integrations), routing events to registered agents.</w:t>
       </w:r>
     </w:p>
     <w:p>
@@ -342,12 +256,12 @@
         <w:rPr>
           <w:color w:val="0A0A0A"/>
         </w:rPr>
-        <w:t>3.5 Module 5 - Developer Dashboard</w:t>
+        <w:t>3.5 Module 5 - Simplified Developer Control Center</w:t>
       </w:r>
     </w:p>
     <w:p>
       <w:r>
-        <w:t>The Developer Dashboard is a React interface built using cinematic dark mode tokens (#0A0A0A background, #121214 cards, OKLCH indigo accents). Key panels include:</w:t>
+        <w:t>The control center frontend was simplified to a clean logs-focused interface:</w:t>
       </w:r>
     </w:p>
     <w:p>
@@ -355,7 +269,7 @@
         <w:pStyle w:val="ListBullet"/>
       </w:pPr>
       <w:r>
-        <w:t>- Agent List Grid: Show active containers with neon-teal active-pulsing rings.</w:t>
+        <w:t>- Sidebar Navigation: CRUD listing of active cognitive containers, registering new agents, edit settings, and deletion controls.</w:t>
       </w:r>
     </w:p>
     <w:p>
@@ -363,7 +277,7 @@
         <w:pStyle w:val="ListBullet"/>
       </w:pPr>
       <w:r>
-        <w:t>- Console Log Stream: Color-coded text console utilizing JetBrains Mono font (indigo for system logs, red for stderr, white for stdout).</w:t>
+        <w:t>- Logs Terminal: Large console output with colored log streams (stderr in red, stdout in white, system logs in blue).</w:t>
       </w:r>
     </w:p>
     <w:p>
@@ -371,15 +285,7 @@
         <w:pStyle w:val="ListBullet"/>
       </w:pPr>
       <w:r>
-        <w:t>- JSON State Inspector: Interactive view of current context variables.</w:t>
-      </w:r>
-    </w:p>
-    <w:p>
-      <w:pPr>
-        <w:pStyle w:val="ListBullet"/>
-      </w:pPr>
-      <w:r>
-        <w:t>- Chronos Timeline: Traces transitions: Trigger -&gt; Active -&gt; Hibernate -&gt; Sleep.</w:t>
+        <w:t>- Billing Panel: Glowing header pill displaying duration (ms), memory (MB), and execution cost ($ USD).</w:t>
       </w:r>
     </w:p>
     <w:p>
@@ -390,47 +296,7 @@
         <w:rPr>
           <w:color w:val="4F46E5"/>
         </w:rPr>
-        <w:t>4. Security Hardening &amp; Mitigations</w:t>
-      </w:r>
-    </w:p>
-    <w:p>
-      <w:r>
-        <w:t>A technical security audit was performed, leading to three concrete hardening patches integrated into the MVP:</w:t>
-      </w:r>
-    </w:p>
-    <w:p>
-      <w:pPr>
-        <w:pStyle w:val="ListBullet"/>
-      </w:pPr>
-      <w:r>
-        <w:t>1. Webhook Denial of Service (DoS) protection: Implemented request payload stream limits. Payloads larger than 1MB are rejected immediately to protect memory allocation.</w:t>
-      </w:r>
-    </w:p>
-    <w:p>
-      <w:pPr>
-        <w:pStyle w:val="ListBullet"/>
-      </w:pPr>
-      <w:r>
-        <w:t>2. Webhook Authentication: Added support for X-AuraOS-Token request signature headers to verify trigger dispatchers.</w:t>
-      </w:r>
-    </w:p>
-    <w:p>
-      <w:pPr>
-        <w:pStyle w:val="ListBullet"/>
-      </w:pPr>
-      <w:r>
-        <w:t>3. Sandbox Containment: Switched ReadonlyRootfs to true, disabling file creation on system directories. Added size-restricted memory-backed tmpfs mounts for temp file writes.</w:t>
-      </w:r>
-    </w:p>
-    <w:p>
-      <w:pPr>
-        <w:pStyle w:val="Heading1"/>
-      </w:pPr>
-      <w:r>
-        <w:rPr>
-          <w:color w:val="4F46E5"/>
-        </w:rPr>
-        <w:t>5. Operations &amp; Execution Guide</w:t>
+        <w:t>4. Operations &amp; Execution Guide</w:t>
       </w:r>
     </w:p>
     <w:tbl>
@@ -579,38 +445,6 @@
           </w:tcPr>
           <w:p>
             <w:r>
-              <w:t>npx tsx src/core/browser/test-browser.ts</w:t>
-            </w:r>
-          </w:p>
-        </w:tc>
-        <w:tc>
-          <w:tcPr>
-            <w:tcW w:type="dxa" w:w="3120"/>
-          </w:tcPr>
-          <w:p>
-            <w:r>
-              <w:t>Playwright API Pool</w:t>
-            </w:r>
-          </w:p>
-        </w:tc>
-        <w:tc>
-          <w:tcPr>
-            <w:tcW w:type="dxa" w:w="3120"/>
-          </w:tcPr>
-          <w:p>
-            <w:r>
-              <w:t>Tests scraping, screenshot capture, and cookie sessions.</w:t>
-            </w:r>
-          </w:p>
-        </w:tc>
-      </w:tr>
-      <w:tr>
-        <w:tc>
-          <w:tcPr>
-            <w:tcW w:type="dxa" w:w="3120"/>
-          </w:tcPr>
-          <w:p>
-            <w:r>
               <w:t>npm run dev</w:t>
             </w:r>
           </w:p>
@@ -631,7 +465,7 @@
           </w:tcPr>
           <w:p>
             <w:r>
-              <w:t>Starts Webhook API server and Live Stream WS broadcaster.</w:t>
+              <w:t>Starts Egress Proxy (port 8086), Webhook API (port 8081), and WebSocket server (port 8085).</w:t>
             </w:r>
           </w:p>
         </w:tc>
@@ -715,7 +549,7 @@
           <w:color w:val="64748B"/>
           <w:sz w:val="18"/>
         </w:rPr>
-        <w:t>AuraOS Runtime Environment Specification v1.0.0 | Confirmed Secure</w:t>
+        <w:t>AuraOS Runtime Environment Specification v1.1.0 | Confirmed Secure</w:t>
       </w:r>
     </w:p>
     <w:sectPr>
@@ -1091,10 +925,6 @@
     <w:name w:val="Normal"/>
     <w:qFormat/>
     <w:rsid w:val="00FC693F"/>
-    <w:rPr>
-      <w:rFonts w:ascii="Arial" w:hAnsi="Arial"/>
-      <w:sz w:val="22"/>
-    </w:rPr>
   </w:style>
   <w:style w:type="paragraph" w:styleId="Header">
     <w:name w:val="header"/>

</xml_diff>